<commit_message>
Sprint 33 complete — punch list, voice notes, Wisetack, completion package, warranty 5yr, UI hotfixes
</commit_message>
<xml_diff>
--- a/src/templates/prepped/warranty-certificate.docx
+++ b/src/templates/prepped/warranty-certificate.docx
@@ -471,7 +471,7 @@
           <w:sz w:val="20"/>
           <w:szCs w:val="20"/>
         </w:rPr>
-        <w:t xml:space="preserve">Columbus Home Solutions LLC ("Contractor") warrants to the original Client at the above property address that all workmanship performed by Contractor will be free from defects in materials and workmanship for a period of one (1) year from the Completion Date listed above ("Warranty Period").</w:t>
+        <w:t xml:space="preserve">Columbus Home Solutions LLC ("Contractor") warrants to the original Client at the above property address that all workmanship performed by Contractor will be free from defects in materials and workmanship for a period of five (5) years from the Completion Date listed above ("Warranty Period").</w:t>
       </w:r>
     </w:p>
     <w:p>
@@ -920,30 +920,42 @@
     </w:p>
     <w:p>
       <w:pPr>
+        <w:spacing w:after="60" w:before="60"/>
+      </w:pPr>
+      <w:r>
+        <w:rPr>
+          <w:sz w:val="20"/>
+          <w:szCs w:val="20"/>
+        </w:rPr>
+        <w:t xml:space="preserve"/>
+      </w:r>
+    </w:p>
+    <w:p>
+      <w:pPr>
         <w:pBdr>
           <w:bottom w:val="single" w:color="000000" w:sz="4" w:space="1"/>
         </w:pBdr>
-        <w:spacing w:after="60" w:before="60"/>
-      </w:pPr>
-      <w:r>
-        <w:rPr>
-          <w:sz w:val="40"/>
-          <w:szCs w:val="40"/>
-        </w:rPr>
-        <w:t xml:space="preserve"/>
-      </w:r>
-    </w:p>
-    <w:p>
-      <w:pPr>
-        <w:spacing w:after="60" w:before="60"/>
-      </w:pPr>
-      <w:r>
-        <w:rPr>
-          <w:rFonts w:ascii="Arial" w:cs="Arial" w:eastAsia="Arial" w:hAnsi="Arial"/>
-          <w:sz w:val="20"/>
-          <w:szCs w:val="20"/>
-        </w:rPr>
-        <w:t xml:space="preserve">Authorized Signature — Columbus Home Solutions LLC</w:t>
+        <w:spacing w:before="0" w:after="40"/>
+      </w:pPr>
+      <w:r>
+        <w:rPr>
+          <w:sz w:val="28"/>
+          <w:szCs w:val="28"/>
+        </w:rPr>
+        <w:t xml:space="preserve">{{contractor_signature}}</w:t>
+      </w:r>
+    </w:p>
+    <w:p>
+      <w:pPr>
+        <w:spacing w:after="60" w:before="60"/>
+      </w:pPr>
+      <w:r>
+        <w:rPr>
+          <w:rFonts w:ascii="Arial" w:cs="Arial" w:eastAsia="Arial" w:hAnsi="Arial"/>
+          <w:sz w:val="20"/>
+          <w:szCs w:val="20"/>
+        </w:rPr>
+        <w:t xml:space="preserve">Tony Columbus, Owner</w:t>
       </w:r>
     </w:p>
     <w:p>
@@ -967,75 +979,56 @@
       </w:pPr>
       <w:r>
         <w:rPr>
-          <w:sz w:val="28"/>
-          <w:szCs w:val="28"/>
-        </w:rPr>
-        <w:t xml:space="preserve"/>
-      </w:r>
-    </w:p>
-    <w:p>
-      <w:pPr>
-        <w:spacing w:after="60" w:before="60"/>
-      </w:pPr>
-      <w:r>
-        <w:rPr>
-          <w:rFonts w:ascii="Arial" w:cs="Arial" w:eastAsia="Arial" w:hAnsi="Arial"/>
-          <w:sz w:val="20"/>
-          <w:szCs w:val="20"/>
-        </w:rPr>
-        <w:t xml:space="preserve">Tony Columbus, Owner</w:t>
-      </w:r>
-    </w:p>
-    <w:p>
-      <w:pPr>
-        <w:spacing w:after="60" w:before="60"/>
-      </w:pPr>
-      <w:r>
-        <w:rPr>
-          <w:sz w:val="20"/>
-          <w:szCs w:val="20"/>
-        </w:rPr>
-        <w:t xml:space="preserve"/>
-      </w:r>
-    </w:p>
-    <w:p>
-      <w:pPr>
-        <w:pBdr>
-          <w:bottom w:val="single" w:color="000000" w:sz="4" w:space="1"/>
-        </w:pBdr>
-        <w:spacing w:after="60" w:before="60"/>
-      </w:pPr>
-      <w:r>
-        <w:rPr>
-          <w:sz w:val="28"/>
-          <w:szCs w:val="28"/>
-        </w:rPr>
-        <w:t xml:space="preserve"/>
-      </w:r>
-    </w:p>
-    <w:p>
-      <w:pPr>
-        <w:spacing w:after="60" w:before="60"/>
-      </w:pPr>
-      <w:r>
-        <w:rPr>
-          <w:rFonts w:ascii="Arial" w:cs="Arial" w:eastAsia="Arial" w:hAnsi="Arial"/>
-          <w:sz w:val="20"/>
-          <w:szCs w:val="20"/>
-        </w:rPr>
-        <w:t xml:space="preserve">Date</w:t>
-      </w:r>
-    </w:p>
-    <w:p>
-      <w:pPr>
-        <w:spacing w:after="60" w:before="60"/>
-      </w:pPr>
-      <w:r>
-        <w:rPr>
-          <w:sz w:val="20"/>
-          <w:szCs w:val="20"/>
-        </w:rPr>
-        <w:t xml:space="preserve"/>
+          <w:rFonts w:ascii="Arial" w:cs="Arial" w:eastAsia="Arial" w:hAnsi="Arial"/>
+          <w:sz w:val="20"/>
+          <w:szCs w:val="20"/>
+        </w:rPr>
+        <w:t xml:space="preserve">{{contractor_date}}</w:t>
+      </w:r>
+    </w:p>
+    <w:p>
+      <w:pPr>
+        <w:spacing w:after="40" w:before="120"/>
+        <w:jc w:val="center"/>
+      </w:pPr>
+      <w:r>
+        <w:rPr>
+          <w:rFonts w:ascii="Arial" w:cs="Arial" w:eastAsia="Arial" w:hAnsi="Arial"/>
+          <w:color w:val="666666"/>
+          <w:sz w:val="18"/>
+          <w:szCs w:val="18"/>
+        </w:rPr>
+        <w:t xml:space="preserve">{{company_address}}</w:t>
+      </w:r>
+    </w:p>
+    <w:p>
+      <w:pPr>
+        <w:spacing w:after="40"/>
+        <w:jc w:val="center"/>
+      </w:pPr>
+      <w:r>
+        <w:rPr>
+          <w:rFonts w:ascii="Arial" w:cs="Arial" w:eastAsia="Arial" w:hAnsi="Arial"/>
+          <w:color w:val="666666"/>
+          <w:sz w:val="18"/>
+          <w:szCs w:val="18"/>
+        </w:rPr>
+        <w:t xml:space="preserve">{{company_phone}} | {{company_email}}</w:t>
+      </w:r>
+    </w:p>
+    <w:p>
+      <w:pPr>
+        <w:spacing w:after="60"/>
+        <w:jc w:val="center"/>
+      </w:pPr>
+      <w:r>
+        <w:rPr>
+          <w:rFonts w:ascii="Arial" w:cs="Arial" w:eastAsia="Arial" w:hAnsi="Arial"/>
+          <w:color w:val="666666"/>
+          <w:sz w:val="18"/>
+          <w:szCs w:val="18"/>
+        </w:rPr>
+        <w:t xml:space="preserve">License No. {{company_license}}</w:t>
       </w:r>
     </w:p>
     <w:p>

</xml_diff>

<commit_message>
Remove One Sheet/Price Match PDF attachments from estimate_sent email; links remain sole delivery path
</commit_message>
<xml_diff>
--- a/src/templates/prepped/warranty-certificate.docx
+++ b/src/templates/prepped/warranty-certificate.docx
@@ -447,6 +447,185 @@
       </w:r>
     </w:p>
     <w:p>
+      <w:p>
+        <w:pPr>
+          <w:spacing w:after="80" w:before="180"/>
+        </w:pPr>
+        <w:r>
+          <w:rPr>
+            <w:rFonts w:ascii="Arial" w:cs="Arial" w:eastAsia="Arial" w:hAnsi="Arial"/>
+            <w:b/>
+            <w:bCs/>
+            <w:sz w:val="22"/>
+            <w:szCs w:val="22"/>
+          </w:rPr>
+          <w:t xml:space="preserve">What Is Covered</w:t>
+        </w:r>
+      </w:p>
+      <w:p>
+        <w:pPr>
+          <w:spacing w:after="60" w:before="60"/>
+        </w:pPr>
+        <w:r>
+          <w:rPr>
+            <w:rFonts w:ascii="Arial" w:cs="Arial" w:eastAsia="Arial" w:hAnsi="Arial"/>
+            <w:sz w:val="20"/>
+            <w:szCs w:val="20"/>
+          </w:rPr>
+          <w:t xml:space="preserve">Columbus Home Solutions, LLC certifies that the workmanship performed on this project is warrantied for the period stated below, subject to the conditions in this certificate. Columbus Home Solutions, LLC agrees to remedy defective workmanship without charge within the warranty period, measured from the date of project completion.</w:t>
+        </w:r>
+      </w:p>
+      <w:p>
+        <w:pPr>
+          <w:spacing w:after="80" w:before="120"/>
+        </w:pPr>
+        <w:r>
+          <w:rPr>
+            <w:rFonts w:ascii="Arial" w:cs="Arial" w:eastAsia="Arial" w:hAnsi="Arial"/>
+            <w:b/>
+            <w:bCs/>
+            <w:sz w:val="20"/>
+            <w:szCs w:val="20"/>
+          </w:rPr>
+          <w:t xml:space="preserve">Warranty Period: Five (5) years from the date of project completion (see Warranty Expires date above).</w:t>
+        </w:r>
+      </w:p>
+      <w:p>
+        <w:pPr>
+          <w:spacing w:after="80" w:before="180"/>
+        </w:pPr>
+        <w:r>
+          <w:rPr>
+            <w:rFonts w:ascii="Arial" w:cs="Arial" w:eastAsia="Arial" w:hAnsi="Arial"/>
+            <w:b/>
+            <w:bCs/>
+            <w:sz w:val="22"/>
+            <w:szCs w:val="22"/>
+          </w:rPr>
+          <w:t xml:space="preserve">What Is Not Covered</w:t>
+        </w:r>
+      </w:p>
+      <w:p>
+        <w:pPr>
+          <w:spacing w:after="60" w:before="60"/>
+        </w:pPr>
+        <w:r>
+          <w:rPr>
+            <w:rFonts w:ascii="Arial" w:cs="Arial" w:eastAsia="Arial" w:hAnsi="Arial"/>
+            <w:sz w:val="20"/>
+            <w:szCs w:val="20"/>
+          </w:rPr>
+          <w:t xml:space="preserve">This warranty covers defects in workmanship only. It does not cover, and Columbus Home Solutions, LLC is not responsible for, defects or damage attributable to: normal wear and tear or normal weathering; damage caused by the Client, occupants, or third parties; damage resulting from improper maintenance or misuse (neglected routine maintenance is not warrantied); accidents, fire, lightning, flood, earthquake, windstorms, windborne objects, ice, hail, or other Acts of God; vandalism, riot, civil disorder, or harmful fumes, vapors, chemical pollutants, or air pollution; mildew, fungus, or salt from the atmosphere or any other source; building settlement or structural failure of the roof, walls, foundation, or any other part of the structure, unless directly caused by Contractor's defective workmanship; any other cause beyond Columbus Home Solutions, LLC's control; pre-existing conditions not included in the original scope of work; issues arising from modifications made by others after project completion; and defects in materials themselves (as distinct from their installation) — material defects are covered by the applicable manufacturer's warranty, not this warranty, and all manufacturer material warranties take precedence over this workmanship warranty.</w:t>
+        </w:r>
+      </w:p>
+      <w:p>
+        <w:pPr>
+          <w:spacing w:after="80" w:before="180"/>
+        </w:pPr>
+        <w:r>
+          <w:rPr>
+            <w:rFonts w:ascii="Arial" w:cs="Arial" w:eastAsia="Arial" w:hAnsi="Arial"/>
+            <w:b/>
+            <w:bCs/>
+            <w:sz w:val="22"/>
+            <w:szCs w:val="22"/>
+          </w:rPr>
+          <w:t xml:space="preserve">How to Make a Warranty Claim</w:t>
+        </w:r>
+      </w:p>
+      <w:p>
+        <w:pPr>
+          <w:spacing w:after="60" w:before="60"/>
+        </w:pPr>
+        <w:r>
+          <w:rPr>
+            <w:rFonts w:ascii="Arial" w:cs="Arial" w:eastAsia="Arial" w:hAnsi="Arial"/>
+            <w:sz w:val="20"/>
+            <w:szCs w:val="20"/>
+          </w:rPr>
+          <w:t xml:space="preserve">To make a warranty claim during the Warranty Period, Client must:</w:t>
+        </w:r>
+      </w:p>
+      <w:p>
+        <w:pPr>
+          <w:spacing w:after="60" w:before="60"/>
+        </w:pPr>
+        <w:r>
+          <w:rPr>
+            <w:rFonts w:ascii="Arial" w:cs="Arial" w:eastAsia="Arial" w:hAnsi="Arial"/>
+            <w:sz w:val="20"/>
+            <w:szCs w:val="20"/>
+          </w:rPr>
+          <w:t xml:space="preserve">• Submit a written description of the defect by email to tony@homesolutionsar.com or by mail to 4414 N Olive St, North Little Rock, AR 72116</w:t>
+        </w:r>
+      </w:p>
+      <w:p>
+        <w:pPr>
+          <w:spacing w:after="60" w:before="60"/>
+        </w:pPr>
+        <w:r>
+          <w:rPr>
+            <w:rFonts w:ascii="Arial" w:cs="Arial" w:eastAsia="Arial" w:hAnsi="Arial"/>
+            <w:sz w:val="20"/>
+            <w:szCs w:val="20"/>
+          </w:rPr>
+          <w:t xml:space="preserve">• Describe the nature of the defect, when it was first noticed, and provide photographs if available</w:t>
+        </w:r>
+      </w:p>
+      <w:p>
+        <w:pPr>
+          <w:spacing w:after="60" w:before="60"/>
+        </w:pPr>
+        <w:r>
+          <w:rPr>
+            <w:rFonts w:ascii="Arial" w:cs="Arial" w:eastAsia="Arial" w:hAnsi="Arial"/>
+            <w:sz w:val="20"/>
+            <w:szCs w:val="20"/>
+          </w:rPr>
+          <w:t xml:space="preserve">• Allow Contractor reasonable access to the property to inspect and repair the defect</w:t>
+        </w:r>
+      </w:p>
+      <w:p>
+        <w:pPr>
+          <w:spacing w:after="60" w:before="120"/>
+        </w:pPr>
+        <w:r>
+          <w:rPr>
+            <w:rFonts w:ascii="Arial" w:cs="Arial" w:eastAsia="Arial" w:hAnsi="Arial"/>
+            <w:sz w:val="20"/>
+            <w:szCs w:val="20"/>
+          </w:rPr>
+          <w:t xml:space="preserve">Contractor will acknowledge warranty claims within 5 business days and schedule repairs within a reasonable timeframe. Contractor's obligation under this warranty is limited to repair or replacement of defective workmanship at Contractor's sole discretion.</w:t>
+        </w:r>
+      </w:p>
+      <w:p>
+        <w:pPr>
+          <w:spacing w:after="80" w:before="180"/>
+        </w:pPr>
+        <w:r>
+          <w:rPr>
+            <w:rFonts w:ascii="Arial" w:cs="Arial" w:eastAsia="Arial" w:hAnsi="Arial"/>
+            <w:b/>
+            <w:bCs/>
+            <w:sz w:val="22"/>
+            <w:szCs w:val="22"/>
+          </w:rPr>
+          <w:t xml:space="preserve">Limitation of Liability</w:t>
+        </w:r>
+      </w:p>
+      <w:p>
+        <w:pPr>
+          <w:spacing w:after="60" w:before="60"/>
+        </w:pPr>
+        <w:r>
+          <w:rPr>
+            <w:rFonts w:ascii="Arial" w:cs="Arial" w:eastAsia="Arial" w:hAnsi="Arial"/>
+            <w:sz w:val="20"/>
+            <w:szCs w:val="20"/>
+          </w:rPr>
+          <w:t xml:space="preserve">Columbus Home Solutions, LLC shall not be liable for injury to persons or for damage to the building or its contents, nor for any incidental, special, or consequential damages, arising from any breach of this warranty, whether written or implied. THIS WARRANTY IS THE SOLE AND EXCLUSIVE WARRANTY PROVIDED BY CONTRACTOR. CONTRACTOR MAKES NO OTHER WARRANTIES, EXPRESS OR IMPLIED, INCLUDING ANY IMPLIED WARRANTY OF MERCHANTABILITY OR FITNESS FOR A PARTICULAR PURPOSE.</w:t>
+        </w:r>
+      </w:p>
       <w:pPr>
         <w:spacing w:after="80" w:before="180"/>
       </w:pPr>
@@ -458,7 +637,7 @@
           <w:sz w:val="22"/>
           <w:szCs w:val="22"/>
         </w:rPr>
-        <w:t xml:space="preserve">What Is Covered</w:t>
+        <w:t xml:space="preserve">Transferability</w:t>
       </w:r>
     </w:p>
     <w:p>
@@ -471,8 +650,28 @@
           <w:sz w:val="20"/>
           <w:szCs w:val="20"/>
         </w:rPr>
-        <w:t xml:space="preserve">Columbus Home Solutions LLC ("Contractor") warrants to the original Client at the above property address that all workmanship performed by Contractor will be free from defects in materials and workmanship for a period of one (1) year from the Completion Date listed above ("Warranty Period").</w:t>
-      </w:r>
+        <w:t xml:space="preserve">This warranty is issued to the original Client only and is not transferable to subsequent property owners.</w:t>
+      </w:r>
+    </w:p>
+    <w:p>
+      <w:pPr>
+        <w:spacing w:after="60" w:before="60"/>
+      </w:pPr>
+      <w:r>
+        <w:rPr>
+          <w:sz w:val="20"/>
+          <w:szCs w:val="20"/>
+        </w:rPr>
+        <w:t xml:space="preserve"/>
+      </w:r>
+    </w:p>
+    <w:p>
+      <w:pPr>
+        <w:pBdr>
+          <w:bottom w:val="single" w:color="1B3A5C" w:sz="4" w:space="1"/>
+        </w:pBdr>
+        <w:spacing w:after="120" w:before="120"/>
+      </w:pPr>
     </w:p>
     <w:p>
       <w:pPr>
@@ -498,7 +697,7 @@
           <w:sz w:val="22"/>
           <w:szCs w:val="22"/>
         </w:rPr>
-        <w:t xml:space="preserve">What Is Not Covered</w:t>
+        <w:t xml:space="preserve">CERTIFICATION</w:t>
       </w:r>
     </w:p>
     <w:p>
@@ -511,50 +710,51 @@
           <w:sz w:val="20"/>
           <w:szCs w:val="20"/>
         </w:rPr>
-        <w:t xml:space="preserve">This warranty does not cover the following:</w:t>
-      </w:r>
-    </w:p>
-    <w:p>
-      <w:pPr>
-        <w:pStyle w:val="ListParagraph"/>
-        <w:numPr>
-          <w:ilvl w:val="0"/>
-          <w:numId w:val="2"/>
-        </w:numPr>
-      </w:pPr>
-      <w:r>
-        <w:rPr>
-          <w:rFonts w:ascii="Arial" w:cs="Arial" w:eastAsia="Arial" w:hAnsi="Arial"/>
+        <w:t xml:space="preserve">Columbus Home Solutions LLC certifies that the work described above was completed in a workmanlike manner and in accordance with the terms of the contract between the parties.</w:t>
+      </w:r>
+    </w:p>
+    <w:p>
+      <w:pPr>
+        <w:spacing w:after="60" w:before="60"/>
+      </w:pPr>
+      <w:r>
+        <w:rPr>
           <w:sz w:val="20"/>
           <w:szCs w:val="20"/>
         </w:rPr>
-        <w:t xml:space="preserve">Damage caused by Client, occupants, or third parties not employed by Contractor</w:t>
-      </w:r>
-    </w:p>
-    <w:p>
-      <w:pPr>
-        <w:pStyle w:val="ListParagraph"/>
-        <w:numPr>
-          <w:ilvl w:val="0"/>
-          <w:numId w:val="2"/>
-        </w:numPr>
-      </w:pPr>
-      <w:r>
-        <w:rPr>
-          <w:rFonts w:ascii="Arial" w:cs="Arial" w:eastAsia="Arial" w:hAnsi="Arial"/>
+        <w:t xml:space="preserve"/>
+      </w:r>
+    </w:p>
+    <w:p>
+      <w:pPr>
+        <w:spacing w:after="60" w:before="60"/>
+      </w:pPr>
+      <w:r>
+        <w:rPr>
           <w:sz w:val="20"/>
           <w:szCs w:val="20"/>
         </w:rPr>
-        <w:t xml:space="preserve">Normal wear and tear, including fading, settling, or weathering</w:t>
-      </w:r>
-    </w:p>
-    <w:p>
-      <w:pPr>
-        <w:pStyle w:val="ListParagraph"/>
-        <w:numPr>
-          <w:ilvl w:val="0"/>
-          <w:numId w:val="2"/>
-        </w:numPr>
+        <w:t xml:space="preserve"/>
+      </w:r>
+    </w:p>
+    <w:p>
+      <w:pPr>
+        <w:pBdr>
+          <w:bottom w:val="single" w:color="000000" w:sz="4" w:space="1"/>
+        </w:pBdr>
+        <w:spacing w:before="0" w:after="40"/>
+      </w:pPr>
+      <w:r>
+        <w:rPr>
+          <w:sz w:val="28"/>
+          <w:szCs w:val="28"/>
+        </w:rPr>
+        <w:t xml:space="preserve">{{contractor_signature}}</w:t>
+      </w:r>
+    </w:p>
+    <w:p>
+      <w:pPr>
+        <w:spacing w:after="60" w:before="60"/>
       </w:pPr>
       <w:r>
         <w:rPr>
@@ -562,348 +762,7 @@
           <w:sz w:val="20"/>
           <w:szCs w:val="20"/>
         </w:rPr>
-        <w:t xml:space="preserve">Damage resulting from acts of God, including storms, flooding, earthquakes, or extreme weather</w:t>
-      </w:r>
-    </w:p>
-    <w:p>
-      <w:pPr>
-        <w:pStyle w:val="ListParagraph"/>
-        <w:numPr>
-          <w:ilvl w:val="0"/>
-          <w:numId w:val="2"/>
-        </w:numPr>
-      </w:pPr>
-      <w:r>
-        <w:rPr>
-          <w:rFonts w:ascii="Arial" w:cs="Arial" w:eastAsia="Arial" w:hAnsi="Arial"/>
-          <w:sz w:val="20"/>
-          <w:szCs w:val="20"/>
-        </w:rPr>
-        <w:t xml:space="preserve">Damage resulting from improper use, neglect, or failure to perform routine maintenance</w:t>
-      </w:r>
-    </w:p>
-    <w:p>
-      <w:pPr>
-        <w:pStyle w:val="ListParagraph"/>
-        <w:numPr>
-          <w:ilvl w:val="0"/>
-          <w:numId w:val="2"/>
-        </w:numPr>
-      </w:pPr>
-      <w:r>
-        <w:rPr>
-          <w:rFonts w:ascii="Arial" w:cs="Arial" w:eastAsia="Arial" w:hAnsi="Arial"/>
-          <w:sz w:val="20"/>
-          <w:szCs w:val="20"/>
-        </w:rPr>
-        <w:t xml:space="preserve">Pre-existing conditions at the property that were present before work began</w:t>
-      </w:r>
-    </w:p>
-    <w:p>
-      <w:pPr>
-        <w:pStyle w:val="ListParagraph"/>
-        <w:numPr>
-          <w:ilvl w:val="0"/>
-          <w:numId w:val="2"/>
-        </w:numPr>
-      </w:pPr>
-      <w:r>
-        <w:rPr>
-          <w:rFonts w:ascii="Arial" w:cs="Arial" w:eastAsia="Arial" w:hAnsi="Arial"/>
-          <w:sz w:val="20"/>
-          <w:szCs w:val="20"/>
-        </w:rPr>
-        <w:t xml:space="preserve">Work performed by Client or third parties after project completion</w:t>
-      </w:r>
-    </w:p>
-    <w:p>
-      <w:pPr>
-        <w:pStyle w:val="ListParagraph"/>
-        <w:numPr>
-          <w:ilvl w:val="0"/>
-          <w:numId w:val="2"/>
-        </w:numPr>
-      </w:pPr>
-      <w:r>
-        <w:rPr>
-          <w:rFonts w:ascii="Arial" w:cs="Arial" w:eastAsia="Arial" w:hAnsi="Arial"/>
-          <w:sz w:val="20"/>
-          <w:szCs w:val="20"/>
-        </w:rPr>
-        <w:t xml:space="preserve">Cosmetic variations in natural materials (wood grain, stone patterns, grout color variation)</w:t>
-      </w:r>
-    </w:p>
-    <w:p>
-      <w:pPr>
-        <w:pStyle w:val="ListParagraph"/>
-        <w:numPr>
-          <w:ilvl w:val="0"/>
-          <w:numId w:val="2"/>
-        </w:numPr>
-      </w:pPr>
-      <w:r>
-        <w:rPr>
-          <w:rFonts w:ascii="Arial" w:cs="Arial" w:eastAsia="Arial" w:hAnsi="Arial"/>
-          <w:sz w:val="20"/>
-          <w:szCs w:val="20"/>
-        </w:rPr>
-        <w:t xml:space="preserve">Manufacturer defects in products or materials (covered by manufacturer warranty separately)</w:t>
-      </w:r>
-    </w:p>
-    <w:p>
-      <w:pPr>
-        <w:spacing w:after="60" w:before="60"/>
-      </w:pPr>
-      <w:r>
-        <w:rPr>
-          <w:sz w:val="20"/>
-          <w:szCs w:val="20"/>
-        </w:rPr>
-        <w:t xml:space="preserve"/>
-      </w:r>
-    </w:p>
-    <w:p>
-      <w:pPr>
-        <w:spacing w:after="80" w:before="180"/>
-      </w:pPr>
-      <w:r>
-        <w:rPr>
-          <w:rFonts w:ascii="Arial" w:cs="Arial" w:eastAsia="Arial" w:hAnsi="Arial"/>
-          <w:b/>
-          <w:bCs/>
-          <w:sz w:val="22"/>
-          <w:szCs w:val="22"/>
-        </w:rPr>
-        <w:t xml:space="preserve">How to Make a Warranty Claim</w:t>
-      </w:r>
-    </w:p>
-    <w:p>
-      <w:pPr>
-        <w:spacing w:after="60" w:before="60"/>
-      </w:pPr>
-      <w:r>
-        <w:rPr>
-          <w:rFonts w:ascii="Arial" w:cs="Arial" w:eastAsia="Arial" w:hAnsi="Arial"/>
-          <w:sz w:val="20"/>
-          <w:szCs w:val="20"/>
-        </w:rPr>
-        <w:t xml:space="preserve">To make a warranty claim during the Warranty Period, Client must:</w:t>
-      </w:r>
-    </w:p>
-    <w:p>
-      <w:pPr>
-        <w:pStyle w:val="ListParagraph"/>
-        <w:numPr>
-          <w:ilvl w:val="0"/>
-          <w:numId w:val="3"/>
-        </w:numPr>
-      </w:pPr>
-      <w:r>
-        <w:rPr>
-          <w:rFonts w:ascii="Arial" w:cs="Arial" w:eastAsia="Arial" w:hAnsi="Arial"/>
-          <w:sz w:val="20"/>
-          <w:szCs w:val="20"/>
-        </w:rPr>
-        <w:t xml:space="preserve">Submit a written description of the defect by email to tony@homesolutionsar.com or by mail to 4414 N Olive St, North Little Rock, AR 72116</w:t>
-      </w:r>
-    </w:p>
-    <w:p>
-      <w:pPr>
-        <w:pStyle w:val="ListParagraph"/>
-        <w:numPr>
-          <w:ilvl w:val="0"/>
-          <w:numId w:val="3"/>
-        </w:numPr>
-      </w:pPr>
-      <w:r>
-        <w:rPr>
-          <w:rFonts w:ascii="Arial" w:cs="Arial" w:eastAsia="Arial" w:hAnsi="Arial"/>
-          <w:sz w:val="20"/>
-          <w:szCs w:val="20"/>
-        </w:rPr>
-        <w:t xml:space="preserve">Describe the nature of the defect, when it was first noticed, and provide photographs if available</w:t>
-      </w:r>
-    </w:p>
-    <w:p>
-      <w:pPr>
-        <w:pStyle w:val="ListParagraph"/>
-        <w:numPr>
-          <w:ilvl w:val="0"/>
-          <w:numId w:val="3"/>
-        </w:numPr>
-      </w:pPr>
-      <w:r>
-        <w:rPr>
-          <w:rFonts w:ascii="Arial" w:cs="Arial" w:eastAsia="Arial" w:hAnsi="Arial"/>
-          <w:sz w:val="20"/>
-          <w:szCs w:val="20"/>
-        </w:rPr>
-        <w:t xml:space="preserve">Allow Contractor reasonable access to the property to inspect and repair the defect</w:t>
-      </w:r>
-    </w:p>
-    <w:p>
-      <w:pPr>
-        <w:spacing w:after="60" w:before="60"/>
-      </w:pPr>
-      <w:r>
-        <w:rPr>
-          <w:sz w:val="20"/>
-          <w:szCs w:val="20"/>
-        </w:rPr>
-        <w:t xml:space="preserve"/>
-      </w:r>
-    </w:p>
-    <w:p>
-      <w:pPr>
-        <w:spacing w:after="60" w:before="60"/>
-      </w:pPr>
-      <w:r>
-        <w:rPr>
-          <w:rFonts w:ascii="Arial" w:cs="Arial" w:eastAsia="Arial" w:hAnsi="Arial"/>
-          <w:sz w:val="20"/>
-          <w:szCs w:val="20"/>
-        </w:rPr>
-        <w:t xml:space="preserve">Contractor will acknowledge warranty claims within 5 business days and schedule repairs within a reasonable timeframe. Contractor's obligation under this warranty is limited to repair or replacement of defective workmanship at Contractor's sole discretion.</w:t>
-      </w:r>
-    </w:p>
-    <w:p>
-      <w:pPr>
-        <w:spacing w:after="60" w:before="60"/>
-      </w:pPr>
-      <w:r>
-        <w:rPr>
-          <w:sz w:val="20"/>
-          <w:szCs w:val="20"/>
-        </w:rPr>
-        <w:t xml:space="preserve"/>
-      </w:r>
-    </w:p>
-    <w:p>
-      <w:pPr>
-        <w:spacing w:after="80" w:before="180"/>
-      </w:pPr>
-      <w:r>
-        <w:rPr>
-          <w:rFonts w:ascii="Arial" w:cs="Arial" w:eastAsia="Arial" w:hAnsi="Arial"/>
-          <w:b/>
-          <w:bCs/>
-          <w:sz w:val="22"/>
-          <w:szCs w:val="22"/>
-        </w:rPr>
-        <w:t xml:space="preserve">Limitation of Liability</w:t>
-      </w:r>
-    </w:p>
-    <w:p>
-      <w:pPr>
-        <w:spacing w:after="60" w:before="60"/>
-      </w:pPr>
-      <w:r>
-        <w:rPr>
-          <w:rFonts w:ascii="Arial" w:cs="Arial" w:eastAsia="Arial" w:hAnsi="Arial"/>
-          <w:sz w:val="20"/>
-          <w:szCs w:val="20"/>
-        </w:rPr>
-        <w:t xml:space="preserve">THIS WARRANTY IS THE SOLE AND EXCLUSIVE WARRANTY PROVIDED BY CONTRACTOR. CONTRACTOR MAKES NO OTHER WARRANTIES, EXPRESS OR IMPLIED, INCLUDING ANY IMPLIED WARRANTY OF MERCHANTABILITY OR FITNESS FOR A PARTICULAR PURPOSE. IN NO EVENT SHALL CONTRACTOR BE LIABLE FOR INCIDENTAL, CONSEQUENTIAL, OR SPECIAL DAMAGES ARISING FROM ANY DEFECT IN WORKMANSHIP.</w:t>
-      </w:r>
-    </w:p>
-    <w:p>
-      <w:pPr>
-        <w:spacing w:after="60" w:before="60"/>
-      </w:pPr>
-      <w:r>
-        <w:rPr>
-          <w:sz w:val="20"/>
-          <w:szCs w:val="20"/>
-        </w:rPr>
-        <w:t xml:space="preserve"/>
-      </w:r>
-    </w:p>
-    <w:p>
-      <w:pPr>
-        <w:spacing w:after="80" w:before="180"/>
-      </w:pPr>
-      <w:r>
-        <w:rPr>
-          <w:rFonts w:ascii="Arial" w:cs="Arial" w:eastAsia="Arial" w:hAnsi="Arial"/>
-          <w:b/>
-          <w:bCs/>
-          <w:sz w:val="22"/>
-          <w:szCs w:val="22"/>
-        </w:rPr>
-        <w:t xml:space="preserve">Transferability</w:t>
-      </w:r>
-    </w:p>
-    <w:p>
-      <w:pPr>
-        <w:spacing w:after="60" w:before="60"/>
-      </w:pPr>
-      <w:r>
-        <w:rPr>
-          <w:rFonts w:ascii="Arial" w:cs="Arial" w:eastAsia="Arial" w:hAnsi="Arial"/>
-          <w:sz w:val="20"/>
-          <w:szCs w:val="20"/>
-        </w:rPr>
-        <w:t xml:space="preserve">This warranty is issued to the original Client only and is not transferable to subsequent property owners.</w:t>
-      </w:r>
-    </w:p>
-    <w:p>
-      <w:pPr>
-        <w:spacing w:after="60" w:before="60"/>
-      </w:pPr>
-      <w:r>
-        <w:rPr>
-          <w:sz w:val="20"/>
-          <w:szCs w:val="20"/>
-        </w:rPr>
-        <w:t xml:space="preserve"/>
-      </w:r>
-    </w:p>
-    <w:p>
-      <w:pPr>
-        <w:pBdr>
-          <w:bottom w:val="single" w:color="1B3A5C" w:sz="4" w:space="1"/>
-        </w:pBdr>
-        <w:spacing w:after="120" w:before="120"/>
-      </w:pPr>
-    </w:p>
-    <w:p>
-      <w:pPr>
-        <w:spacing w:after="60" w:before="60"/>
-      </w:pPr>
-      <w:r>
-        <w:rPr>
-          <w:sz w:val="20"/>
-          <w:szCs w:val="20"/>
-        </w:rPr>
-        <w:t xml:space="preserve"/>
-      </w:r>
-    </w:p>
-    <w:p>
-      <w:pPr>
-        <w:spacing w:after="80" w:before="180"/>
-      </w:pPr>
-      <w:r>
-        <w:rPr>
-          <w:rFonts w:ascii="Arial" w:cs="Arial" w:eastAsia="Arial" w:hAnsi="Arial"/>
-          <w:b/>
-          <w:bCs/>
-          <w:sz w:val="22"/>
-          <w:szCs w:val="22"/>
-        </w:rPr>
-        <w:t xml:space="preserve">CERTIFICATION</w:t>
-      </w:r>
-    </w:p>
-    <w:p>
-      <w:pPr>
-        <w:spacing w:after="60" w:before="60"/>
-      </w:pPr>
-      <w:r>
-        <w:rPr>
-          <w:rFonts w:ascii="Arial" w:cs="Arial" w:eastAsia="Arial" w:hAnsi="Arial"/>
-          <w:sz w:val="20"/>
-          <w:szCs w:val="20"/>
-        </w:rPr>
-        <w:t xml:space="preserve">Columbus Home Solutions LLC certifies that the work described above was completed in a workmanlike manner and in accordance with the terms of the contract between the parties.</w:t>
+        <w:t xml:space="preserve">Tony Columbus, Owner</w:t>
       </w:r>
     </w:p>
     <w:p>
@@ -927,115 +786,56 @@
       </w:pPr>
       <w:r>
         <w:rPr>
-          <w:sz w:val="40"/>
-          <w:szCs w:val="40"/>
-        </w:rPr>
-        <w:t xml:space="preserve"/>
-      </w:r>
-    </w:p>
-    <w:p>
-      <w:pPr>
-        <w:spacing w:after="60" w:before="60"/>
-      </w:pPr>
-      <w:r>
-        <w:rPr>
           <w:rFonts w:ascii="Arial" w:cs="Arial" w:eastAsia="Arial" w:hAnsi="Arial"/>
           <w:sz w:val="20"/>
           <w:szCs w:val="20"/>
         </w:rPr>
-        <w:t xml:space="preserve">Authorized Signature — Columbus Home Solutions LLC</w:t>
-      </w:r>
-    </w:p>
-    <w:p>
-      <w:pPr>
-        <w:spacing w:after="60" w:before="60"/>
-      </w:pPr>
-      <w:r>
-        <w:rPr>
-          <w:sz w:val="20"/>
-          <w:szCs w:val="20"/>
-        </w:rPr>
-        <w:t xml:space="preserve"/>
-      </w:r>
-    </w:p>
-    <w:p>
-      <w:pPr>
-        <w:pBdr>
-          <w:bottom w:val="single" w:color="000000" w:sz="4" w:space="1"/>
-        </w:pBdr>
-        <w:spacing w:after="60" w:before="60"/>
-      </w:pPr>
-      <w:r>
-        <w:rPr>
-          <w:sz w:val="28"/>
-          <w:szCs w:val="28"/>
-        </w:rPr>
-        <w:t xml:space="preserve"/>
-      </w:r>
-    </w:p>
-    <w:p>
-      <w:pPr>
-        <w:spacing w:after="60" w:before="60"/>
-      </w:pPr>
-      <w:r>
-        <w:rPr>
-          <w:rFonts w:ascii="Arial" w:cs="Arial" w:eastAsia="Arial" w:hAnsi="Arial"/>
-          <w:sz w:val="20"/>
-          <w:szCs w:val="20"/>
-        </w:rPr>
-        <w:t xml:space="preserve">Tony Columbus, Owner</w:t>
-      </w:r>
-    </w:p>
-    <w:p>
-      <w:pPr>
-        <w:spacing w:after="60" w:before="60"/>
-      </w:pPr>
-      <w:r>
-        <w:rPr>
-          <w:sz w:val="20"/>
-          <w:szCs w:val="20"/>
-        </w:rPr>
-        <w:t xml:space="preserve"/>
-      </w:r>
-    </w:p>
-    <w:p>
-      <w:pPr>
-        <w:pBdr>
-          <w:bottom w:val="single" w:color="000000" w:sz="4" w:space="1"/>
-        </w:pBdr>
-        <w:spacing w:after="60" w:before="60"/>
-      </w:pPr>
-      <w:r>
-        <w:rPr>
-          <w:sz w:val="28"/>
-          <w:szCs w:val="28"/>
-        </w:rPr>
-        <w:t xml:space="preserve"/>
-      </w:r>
-    </w:p>
-    <w:p>
-      <w:pPr>
-        <w:spacing w:after="60" w:before="60"/>
-      </w:pPr>
-      <w:r>
-        <w:rPr>
-          <w:rFonts w:ascii="Arial" w:cs="Arial" w:eastAsia="Arial" w:hAnsi="Arial"/>
-          <w:sz w:val="20"/>
-          <w:szCs w:val="20"/>
-        </w:rPr>
-        <w:t xml:space="preserve">Date</w:t>
-      </w:r>
-    </w:p>
-    <w:p>
-      <w:pPr>
-        <w:spacing w:after="60" w:before="60"/>
-      </w:pPr>
-      <w:r>
-        <w:rPr>
-          <w:sz w:val="20"/>
-          <w:szCs w:val="20"/>
-        </w:rPr>
-        <w:t xml:space="preserve"/>
+        <w:t xml:space="preserve">{{contractor_date}}</w:t>
+      </w:r>
+    </w:p>
+    <w:p>
+      <w:pPr>
+        <w:spacing w:after="40" w:before="120"/>
+        <w:jc w:val="center"/>
+      </w:pPr>
+      <w:r>
+        <w:rPr>
+          <w:rFonts w:ascii="Arial" w:cs="Arial" w:eastAsia="Arial" w:hAnsi="Arial"/>
+          <w:color w:val="666666"/>
+          <w:sz w:val="18"/>
+          <w:szCs w:val="18"/>
+        </w:rPr>
+        <w:t xml:space="preserve">{{company_address}}</w:t>
+      </w:r>
+    </w:p>
+    <w:p>
+      <w:pPr>
+        <w:spacing w:after="40"/>
+        <w:jc w:val="center"/>
+      </w:pPr>
+      <w:r>
+        <w:rPr>
+          <w:rFonts w:ascii="Arial" w:cs="Arial" w:eastAsia="Arial" w:hAnsi="Arial"/>
+          <w:color w:val="666666"/>
+          <w:sz w:val="18"/>
+          <w:szCs w:val="18"/>
+        </w:rPr>
+        <w:t xml:space="preserve">{{company_phone}} | {{company_email}}</w:t>
+      </w:r>
+    </w:p>
+    <w:p>
+      <w:pPr>
+        <w:spacing w:after="60"/>
+        <w:jc w:val="center"/>
+      </w:pPr>
+      <w:r>
+        <w:rPr>
+          <w:rFonts w:ascii="Arial" w:cs="Arial" w:eastAsia="Arial" w:hAnsi="Arial"/>
+          <w:color w:val="666666"/>
+          <w:sz w:val="18"/>
+          <w:szCs w:val="18"/>
+        </w:rPr>
+        <w:t xml:space="preserve">License No. {{company_license}}</w:t>
       </w:r>
     </w:p>
     <w:p>

</xml_diff>